<commit_message>
Done from the home page, and correct somethings in the welcome page
</commit_message>
<xml_diff>
--- a/docs/SRS - FT (No IDs).docx
+++ b/docs/SRS - FT (No IDs).docx
@@ -842,10 +842,10 @@
         <w:t xml:space="preserve"> Dr. Khalid Riadh</w:t>
       </w:r>
     </w:p>
-    <w:bookmarkStart w:id="0" w:name="_Toc225226026" w:displacedByCustomXml="next"/>
-    <w:bookmarkStart w:id="1" w:name="_Toc225350573" w:displacedByCustomXml="next"/>
-    <w:bookmarkStart w:id="2" w:name="_Toc225350652" w:displacedByCustomXml="next"/>
-    <w:bookmarkStart w:id="3" w:name="_Toc226815504" w:displacedByCustomXml="next"/>
+    <w:bookmarkStart w:id="0" w:name="_Toc226815504" w:displacedByCustomXml="next"/>
+    <w:bookmarkStart w:id="1" w:name="_Toc225350652" w:displacedByCustomXml="next"/>
+    <w:bookmarkStart w:id="2" w:name="_Toc225350573" w:displacedByCustomXml="next"/>
+    <w:bookmarkStart w:id="3" w:name="_Toc225226026" w:displacedByCustomXml="next"/>
     <w:sdt>
       <w:sdtPr>
         <w:rPr>
@@ -2847,25 +2847,7 @@
           <w:sz w:val="28"/>
           <w:szCs w:val="28"/>
         </w:rPr>
-        <w:t xml:space="preserve">, the user shall be able to see his exercises with the ability to see and edit the weights he lifts (kg or </w:t>
-      </w:r>
-      <w:proofErr w:type="spellStart"/>
-      <w:r>
-        <w:rPr>
-          <w:rFonts w:ascii="Calibri" w:eastAsia="Calibri" w:hAnsi="Calibri" w:cs="Arial"/>
-          <w:sz w:val="28"/>
-          <w:szCs w:val="28"/>
-        </w:rPr>
-        <w:t>lb</w:t>
-      </w:r>
-      <w:proofErr w:type="spellEnd"/>
-      <w:r>
-        <w:rPr>
-          <w:rFonts w:ascii="Calibri" w:eastAsia="Calibri" w:hAnsi="Calibri" w:cs="Arial"/>
-          <w:sz w:val="28"/>
-          <w:szCs w:val="28"/>
-        </w:rPr>
-        <w:t>).</w:t>
+        <w:t>, the user shall be able to see his exercises with the ability to see and edit the weights he lifts (kg or lb).</w:t>
       </w:r>
     </w:p>
     <w:p>
@@ -6530,34 +6512,15 @@
           <w:szCs w:val="32"/>
           <w:u w:val="single"/>
         </w:rPr>
-        <w:t xml:space="preserve">Create </w:t>
-      </w:r>
-      <w:proofErr w:type="gramStart"/>
-      <w:r>
-        <w:rPr>
-          <w:rFonts w:ascii="Calibri" w:eastAsia="Calibri" w:hAnsi="Calibri" w:cs="Arial"/>
-          <w:sz w:val="32"/>
-          <w:szCs w:val="32"/>
-          <w:u w:val="single"/>
-        </w:rPr>
-        <w:t>now</w:t>
-      </w:r>
-      <w:r>
-        <w:rPr>
-          <w:rFonts w:ascii="Calibri" w:eastAsia="Calibri" w:hAnsi="Calibri" w:cs="Arial"/>
-          <w:sz w:val="32"/>
-          <w:szCs w:val="32"/>
-        </w:rPr>
-        <w:t>“ option</w:t>
-      </w:r>
-      <w:proofErr w:type="gramEnd"/>
-      <w:r>
-        <w:rPr>
-          <w:rFonts w:ascii="Calibri" w:eastAsia="Calibri" w:hAnsi="Calibri" w:cs="Arial"/>
-          <w:sz w:val="32"/>
-          <w:szCs w:val="32"/>
-        </w:rPr>
-        <w:t>.</w:t>
+        <w:t>Create now</w:t>
+      </w:r>
+      <w:r>
+        <w:rPr>
+          <w:rFonts w:ascii="Calibri" w:eastAsia="Calibri" w:hAnsi="Calibri" w:cs="Arial"/>
+          <w:sz w:val="32"/>
+          <w:szCs w:val="32"/>
+        </w:rPr>
+        <w:t>“ option.</w:t>
       </w:r>
     </w:p>
     <w:p>
@@ -6811,7 +6774,7 @@
           <w:sz w:val="32"/>
           <w:szCs w:val="32"/>
         </w:rPr>
-        <w:t>It must show a form like the sign-in form, which asks for the email and the password.</w:t>
+        <w:t>It must show a form like the sign-in form, which asks for the password.</w:t>
       </w:r>
     </w:p>
     <w:p>
@@ -6905,25 +6868,7 @@
           <w:sz w:val="32"/>
           <w:szCs w:val="32"/>
         </w:rPr>
-        <w:t>It shall show the rights of the team “</w:t>
-      </w:r>
-      <w:proofErr w:type="gramStart"/>
-      <w:r>
-        <w:rPr>
-          <w:rFonts w:ascii="Calibri" w:eastAsia="Calibri" w:hAnsi="Calibri" w:cs="Arial"/>
-          <w:sz w:val="32"/>
-          <w:szCs w:val="32"/>
-        </w:rPr>
-        <w:t>Group(</w:t>
-      </w:r>
-      <w:proofErr w:type="gramEnd"/>
-      <w:r>
-        <w:rPr>
-          <w:rFonts w:ascii="Calibri" w:eastAsia="Calibri" w:hAnsi="Calibri" w:cs="Arial"/>
-          <w:sz w:val="32"/>
-          <w:szCs w:val="32"/>
-        </w:rPr>
-        <w:t>1)”, and when clicking on it a dropdown menu appears which contains the members names, Linked in, and GitHub.</w:t>
+        <w:t>It shall show the rights of the team “Group(1)”, and when clicking on it a dropdown menu appears which contains the members names, Linked in, and GitHub.</w:t>
       </w:r>
     </w:p>
     <w:p>

</xml_diff>

<commit_message>
Welcome & home HTML (#5)
* done from welcome-page html

* Done from the home page, and correct somethings in the welcome page
</commit_message>
<xml_diff>
--- a/docs/SRS - FT (No IDs).docx
+++ b/docs/SRS - FT (No IDs).docx
@@ -842,10 +842,10 @@
         <w:t xml:space="preserve"> Dr. Khalid Riadh</w:t>
       </w:r>
     </w:p>
-    <w:bookmarkStart w:id="0" w:name="_Toc225226026" w:displacedByCustomXml="next"/>
-    <w:bookmarkStart w:id="1" w:name="_Toc225350573" w:displacedByCustomXml="next"/>
-    <w:bookmarkStart w:id="2" w:name="_Toc225350652" w:displacedByCustomXml="next"/>
-    <w:bookmarkStart w:id="3" w:name="_Toc226815504" w:displacedByCustomXml="next"/>
+    <w:bookmarkStart w:id="0" w:name="_Toc226815504" w:displacedByCustomXml="next"/>
+    <w:bookmarkStart w:id="1" w:name="_Toc225350652" w:displacedByCustomXml="next"/>
+    <w:bookmarkStart w:id="2" w:name="_Toc225350573" w:displacedByCustomXml="next"/>
+    <w:bookmarkStart w:id="3" w:name="_Toc225226026" w:displacedByCustomXml="next"/>
     <w:sdt>
       <w:sdtPr>
         <w:rPr>
@@ -2847,25 +2847,7 @@
           <w:sz w:val="28"/>
           <w:szCs w:val="28"/>
         </w:rPr>
-        <w:t xml:space="preserve">, the user shall be able to see his exercises with the ability to see and edit the weights he lifts (kg or </w:t>
-      </w:r>
-      <w:proofErr w:type="spellStart"/>
-      <w:r>
-        <w:rPr>
-          <w:rFonts w:ascii="Calibri" w:eastAsia="Calibri" w:hAnsi="Calibri" w:cs="Arial"/>
-          <w:sz w:val="28"/>
-          <w:szCs w:val="28"/>
-        </w:rPr>
-        <w:t>lb</w:t>
-      </w:r>
-      <w:proofErr w:type="spellEnd"/>
-      <w:r>
-        <w:rPr>
-          <w:rFonts w:ascii="Calibri" w:eastAsia="Calibri" w:hAnsi="Calibri" w:cs="Arial"/>
-          <w:sz w:val="28"/>
-          <w:szCs w:val="28"/>
-        </w:rPr>
-        <w:t>).</w:t>
+        <w:t>, the user shall be able to see his exercises with the ability to see and edit the weights he lifts (kg or lb).</w:t>
       </w:r>
     </w:p>
     <w:p>
@@ -6530,34 +6512,15 @@
           <w:szCs w:val="32"/>
           <w:u w:val="single"/>
         </w:rPr>
-        <w:t xml:space="preserve">Create </w:t>
-      </w:r>
-      <w:proofErr w:type="gramStart"/>
-      <w:r>
-        <w:rPr>
-          <w:rFonts w:ascii="Calibri" w:eastAsia="Calibri" w:hAnsi="Calibri" w:cs="Arial"/>
-          <w:sz w:val="32"/>
-          <w:szCs w:val="32"/>
-          <w:u w:val="single"/>
-        </w:rPr>
-        <w:t>now</w:t>
-      </w:r>
-      <w:r>
-        <w:rPr>
-          <w:rFonts w:ascii="Calibri" w:eastAsia="Calibri" w:hAnsi="Calibri" w:cs="Arial"/>
-          <w:sz w:val="32"/>
-          <w:szCs w:val="32"/>
-        </w:rPr>
-        <w:t>“ option</w:t>
-      </w:r>
-      <w:proofErr w:type="gramEnd"/>
-      <w:r>
-        <w:rPr>
-          <w:rFonts w:ascii="Calibri" w:eastAsia="Calibri" w:hAnsi="Calibri" w:cs="Arial"/>
-          <w:sz w:val="32"/>
-          <w:szCs w:val="32"/>
-        </w:rPr>
-        <w:t>.</w:t>
+        <w:t>Create now</w:t>
+      </w:r>
+      <w:r>
+        <w:rPr>
+          <w:rFonts w:ascii="Calibri" w:eastAsia="Calibri" w:hAnsi="Calibri" w:cs="Arial"/>
+          <w:sz w:val="32"/>
+          <w:szCs w:val="32"/>
+        </w:rPr>
+        <w:t>“ option.</w:t>
       </w:r>
     </w:p>
     <w:p>
@@ -6811,7 +6774,7 @@
           <w:sz w:val="32"/>
           <w:szCs w:val="32"/>
         </w:rPr>
-        <w:t>It must show a form like the sign-in form, which asks for the email and the password.</w:t>
+        <w:t>It must show a form like the sign-in form, which asks for the password.</w:t>
       </w:r>
     </w:p>
     <w:p>
@@ -6905,25 +6868,7 @@
           <w:sz w:val="32"/>
           <w:szCs w:val="32"/>
         </w:rPr>
-        <w:t>It shall show the rights of the team “</w:t>
-      </w:r>
-      <w:proofErr w:type="gramStart"/>
-      <w:r>
-        <w:rPr>
-          <w:rFonts w:ascii="Calibri" w:eastAsia="Calibri" w:hAnsi="Calibri" w:cs="Arial"/>
-          <w:sz w:val="32"/>
-          <w:szCs w:val="32"/>
-        </w:rPr>
-        <w:t>Group(</w:t>
-      </w:r>
-      <w:proofErr w:type="gramEnd"/>
-      <w:r>
-        <w:rPr>
-          <w:rFonts w:ascii="Calibri" w:eastAsia="Calibri" w:hAnsi="Calibri" w:cs="Arial"/>
-          <w:sz w:val="32"/>
-          <w:szCs w:val="32"/>
-        </w:rPr>
-        <w:t>1)”, and when clicking on it a dropdown menu appears which contains the members names, Linked in, and GitHub.</w:t>
+        <w:t>It shall show the rights of the team “Group(1)”, and when clicking on it a dropdown menu appears which contains the members names, Linked in, and GitHub.</w:t>
       </w:r>
     </w:p>
     <w:p>

</xml_diff>